<commit_message>
Alinear permisos de mascotas y preparar ruta de salud
</commit_message>
<xml_diff>
--- a/Vedia_Salazar_Perfil_Proyecto_Corregido.docx
+++ b/Vedia_Salazar_Perfil_Proyecto_Corregido.docx
@@ -3202,7 +3202,58 @@
         <w:spacing w:before="60" w:after="240"/>
       </w:pPr>
       <w:r>
-        <w:t>Herramienta de tablero: GitHub Projects (crear/enlazar el tablero y añadir captura fechada antes de entregar) · Límite de trabajo en curso: 2 tarjetas.</w:t>
+        <w:t xml:space="preserve">Herramienta de tablero: GitHub Projects. Enlace: </w:t>
+      </w:r>
+      <w:hyperlink r:id="rId19">
+        <w:r>
+          <w:rPr>
+            <w:color w:val="0563C1"/>
+            <w:u w:val="single"/>
+          </w:rPr>
+          <w:t>abrir tablero</w:t>
+        </w:r>
+      </w:hyperlink>
+      <w:r>
+        <w:t>. Límite de trabajo en curso: 2 tarjetas.</w:t>
+      </w:r>
+    </w:p>
+    <w:p>
+      <w:pPr>
+        <w:jc w:val="center"/>
+      </w:pPr>
+      <w:r>
+        <w:drawing>
+          <wp:inline xmlns:a="http://schemas.openxmlformats.org/drawingml/2006/main" xmlns:pic="http://schemas.openxmlformats.org/drawingml/2006/picture">
+            <wp:extent cx="5715000" cy="4383350"/>
+            <wp:docPr id="6" name="Picture 6" descr="Captura del tablero Kanban de GitHub Projects con las columnas Hacer, En curso y Hecho y sus tarjetas visibles al 2 de octubre de 2026."/>
+            <wp:cNvGraphicFramePr>
+              <a:graphicFrameLocks noChangeAspect="1"/>
+            </wp:cNvGraphicFramePr>
+            <a:graphic>
+              <a:graphicData uri="http://schemas.openxmlformats.org/drawingml/2006/picture">
+                <pic:pic>
+                  <pic:nvPicPr>
+                    <pic:cNvPr id="0" name="codex-clipboard-9338f942-0a95-4bbc-83bc-b97dfdb7b3a2.png"/>
+                    <pic:cNvPicPr/>
+                  </pic:nvPicPr>
+                  <pic:blipFill>
+                    <a:blip r:embed="rId20"/>
+                    <a:stretch>
+                      <a:fillRect/>
+                    </a:stretch>
+                  </pic:blipFill>
+                  <pic:spPr>
+                    <a:xfrm>
+                      <a:off x="0" y="0"/>
+                      <a:ext cx="5715000" cy="4383350"/>
+                    </a:xfrm>
+                    <a:prstGeom prst="rect"/>
+                  </pic:spPr>
+                </pic:pic>
+              </a:graphicData>
+            </a:graphic>
+          </wp:inline>
+        </w:drawing>
       </w:r>
     </w:p>
     <w:p>
@@ -3210,7 +3261,7 @@
         <w:spacing w:before="60" w:after="240"/>
       </w:pPr>
       <w:r>
-        <w:t>Figura 1. Tablero GitHub Projects al cierre de la iteración 1 (captura por incorporar). Fuente: elaboración propia.</w:t>
+        <w:t>Figura 1. Tablero Kanban del proyecto en GitHub Projects, con el estado de las tareas al 2 de octubre de 2026. Fuente: elaboración propia.</w:t>
       </w:r>
     </w:p>
     <w:p>
@@ -4135,7 +4186,7 @@
           </w:tcPr>
           <w:p>
             <w:r>
-              <w:t>Como personal veterinario, quiero crear la cuenta de acceso del propietario e ingresar sus datos y los de su mascota, para mantener organizada la información de los pacientes atendidos.</w:t>
+              <w:t>Como administrador o veterinario, quiero crear la cuenta de acceso del propietario e ingresar sus datos y los de su mascota, para mantener organizada la información de los pacientes atendidos.</w:t>
             </w:r>
           </w:p>
         </w:tc>
@@ -4151,7 +4202,7 @@
           </w:tcPr>
           <w:p>
             <w:r>
-              <w:t>CA-02.1: Dado que el personal veterinario está autenticado y registra datos completos del propietario y su mascota, cuando confirma el formulario, entonces el sistema crea o vincula la cuenta del propietario y guarda ambos registros.</w:t>
+              <w:t>CA-02.1: Dado que el administrador o veterinario está autenticado y registra datos completos del propietario y su mascota, cuando confirma el formulario, entonces el sistema crea o vincula la cuenta del propietario y guarda ambos registros.</w:t>
               <w:br/>
               <w:br/>
               <w:t>CA-02.2: Dado que faltan campos obligatorios o la creación de cuenta no puede completarse de forma segura, cuando se confirma el registro, entonces el sistema informa el error y no guarda registros parciales.</w:t>
@@ -5042,139 +5093,36 @@
             </w:tcMar>
           </w:tcPr>
           <w:p>
-            <w:pPr>
-              <w:spacing w:after="20" w:line="240" w:lineRule="auto"/>
-              <w:rPr>
-                <w:sz w:val="20"/>
-                <w:szCs w:val="20"/>
-              </w:rPr>
-            </w:pPr>
-            <w:r>
-              <w:rPr>
-                <w:sz w:val="20"/>
-                <w:szCs w:val="20"/>
-              </w:rPr>
-              <w:t xml:space="preserve">Como </w:t>
-            </w:r>
+            <w:r>
+              <w:rPr>
+                <w:sz w:val="20"/>
+                <w:szCs w:val="20"/>
+              </w:rPr>
+              <w:t>Como administrador o veterinario, quiero actualizar y, cuando corresponda, eliminar registros de mascotas, para mantener sus datos correctos.</w:t>
+            </w:r>
+          </w:p>
+        </w:tc>
+        <w:tc>
+          <w:tcPr>
+            <w:tcW w:w="3400" w:type="dxa"/>
+            <w:tcMar>
+              <w:top w:w="60" w:type="dxa"/>
+              <w:left w:w="100" w:type="dxa"/>
+              <w:bottom w:w="60" w:type="dxa"/>
+              <w:right w:w="100" w:type="dxa"/>
+            </w:tcMar>
+          </w:tcPr>
+          <w:p>
             <w:r>
               <w:rPr>
                 <w:rStyle w:val="Textoennegrita"/>
-                <w:b w:val="0"/>
-                <w:sz w:val="20"/>
-                <w:szCs w:val="20"/>
-              </w:rPr>
-              <w:t>personal veterinario</w:t>
-            </w:r>
-            <w:r>
-              <w:rPr>
-                <w:b/>
-                <w:sz w:val="20"/>
-                <w:szCs w:val="20"/>
-              </w:rPr>
-              <w:t>,</w:t>
-            </w:r>
-            <w:r>
-              <w:rPr>
-                <w:sz w:val="20"/>
-                <w:szCs w:val="20"/>
-              </w:rPr>
-              <w:t xml:space="preserve"> quiero </w:t>
-            </w:r>
-            <w:r>
-              <w:rPr>
-                <w:rStyle w:val="Textoennegrita"/>
-                <w:b w:val="0"/>
-                <w:sz w:val="20"/>
-                <w:szCs w:val="20"/>
-              </w:rPr>
-              <w:t>actualizar información de clientes, mascotas y atenciones</w:t>
-            </w:r>
-            <w:r>
-              <w:rPr>
-                <w:sz w:val="20"/>
-                <w:szCs w:val="20"/>
-              </w:rPr>
-              <w:t xml:space="preserve">, para </w:t>
-            </w:r>
-            <w:r>
-              <w:rPr>
-                <w:rStyle w:val="Textoennegrita"/>
-                <w:b w:val="0"/>
-                <w:sz w:val="20"/>
-                <w:szCs w:val="20"/>
-              </w:rPr>
-              <w:t>mantener los registros actualizados</w:t>
-            </w:r>
-            <w:r>
-              <w:rPr>
-                <w:sz w:val="20"/>
-                <w:szCs w:val="20"/>
-              </w:rPr>
-              <w:t>.</w:t>
-            </w:r>
-          </w:p>
-        </w:tc>
-        <w:tc>
-          <w:tcPr>
-            <w:tcW w:w="3400" w:type="dxa"/>
-            <w:tcMar>
-              <w:top w:w="60" w:type="dxa"/>
-              <w:left w:w="100" w:type="dxa"/>
-              <w:bottom w:w="60" w:type="dxa"/>
-              <w:right w:w="100" w:type="dxa"/>
-            </w:tcMar>
-          </w:tcPr>
-          <w:p>
-            <w:pPr>
-              <w:spacing w:after="20" w:line="240" w:lineRule="auto"/>
-              <w:rPr>
-                <w:sz w:val="20"/>
-                <w:szCs w:val="20"/>
-              </w:rPr>
-            </w:pPr>
-            <w:r>
-              <w:rPr>
-                <w:rStyle w:val="Textoennegrita"/>
-                <w:sz w:val="20"/>
-                <w:szCs w:val="20"/>
-              </w:rPr>
-              <w:t>CA-07.1:</w:t>
-            </w:r>
-            <w:r>
-              <w:rPr>
-                <w:sz w:val="20"/>
-                <w:szCs w:val="20"/>
-              </w:rPr>
-              <w:t xml:space="preserve"> Dado que existe un registro almacenado, cuando el usuario modifica información válida, entonces el sistema actualiza los datos correctamente.</w:t>
-            </w:r>
-            <w:r>
-              <w:rPr>
-                <w:sz w:val="20"/>
-                <w:szCs w:val="20"/>
-              </w:rPr>
+                <w:sz w:val="20"/>
+                <w:szCs w:val="20"/>
+              </w:rPr>
+              <w:t>CA-07.1: Dado que existe una mascota registrada, cuando el administrador o veterinario modifica datos válidos, entonces el sistema actualiza el registro; si confirma su eliminación y no hay referencias que la impidan, el sistema la elimina.</w:t>
               <w:br/>
-            </w:r>
-            <w:r>
-              <w:rPr>
-                <w:sz w:val="20"/>
-                <w:szCs w:val="20"/>
-              </w:rPr>
               <w:br/>
-            </w:r>
-            <w:r>
-              <w:rPr>
-                <w:rStyle w:val="Textoennegrita"/>
-                <w:sz w:val="20"/>
-                <w:szCs w:val="20"/>
-              </w:rPr>
-              <w:t>CA-07.2:</w:t>
-            </w:r>
-            <w:r>
-              <w:rPr>
-                <w:sz w:val="20"/>
-                <w:szCs w:val="20"/>
-              </w:rPr>
-              <w:t xml:space="preserve"> Dado que se ingresan datos inválidos, cuando se intenta actualizar un registro, entonces el sistema rechaza la modificación e indica el error.</w:t>
+              <w:t>CA-07.2: Dado que un propietario intenta crear, editar o eliminar una mascota, cuando envía la solicitud, entonces las políticas RLS impiden la operación.</w:t>
             </w:r>
           </w:p>
         </w:tc>
@@ -6806,7 +6754,7 @@
       <w:r>
         <w:t>Actor principal:</w:t>
         <w:br/>
-        <w:t>Personal veterinario</w:t>
+        <w:t>Administrador o veterinario</w:t>
       </w:r>
     </w:p>
     <w:p>
@@ -6820,7 +6768,7 @@
       <w:r>
         <w:t>Precondición:</w:t>
         <w:br/>
-        <w:t>El personal veterinario debe haber iniciado sesión.</w:t>
+        <w:t>El administrador o veterinario debe haber iniciado sesión.</w:t>
       </w:r>
     </w:p>
     <w:p>
@@ -7489,7 +7437,7 @@
           </w:tcPr>
           <w:p>
             <w:r>
-              <w:t>Personal veterinario</w:t>
+              <w:t>Personal veterinario / administrador</w:t>
             </w:r>
           </w:p>
         </w:tc>
@@ -8515,7 +8463,7 @@
           </w:tcPr>
           <w:p>
             <w:r>
-              <w:t>Identificador del propietario.</w:t>
+              <w:t>Ficha de contacto manual creada por el personal. No es una cuenta de acceso móvil.</w:t>
             </w:r>
           </w:p>
         </w:tc>
@@ -8527,7 +8475,7 @@
           </w:tcPr>
           <w:p>
             <w:r>
-              <w:t>PROPIETARIO</w:t>
+              <w:t>CLIENTE</w:t>
             </w:r>
           </w:p>
         </w:tc>
@@ -8537,7 +8485,7 @@
           </w:tcPr>
           <w:p>
             <w:r>
-              <w:t>id_usuario</w:t>
+              <w:t>id</w:t>
             </w:r>
           </w:p>
         </w:tc>
@@ -8567,7 +8515,7 @@
           </w:tcPr>
           <w:p>
             <w:r>
-              <w:t>FK auth.users.id</w:t>
+              <w:t>PK; FK auth.users.id</w:t>
             </w:r>
           </w:p>
         </w:tc>
@@ -8577,7 +8525,7 @@
           </w:tcPr>
           <w:p>
             <w:r>
-              <w:t>Identidad de Auth asociada para aplicar acceso individual. La columna y su política RLS deben existir en el esquema desplegado.</w:t>
+              <w:t>Cuenta autenticada del propietario en la app móvil. El ID coincide con el usuario de Supabase Auth.</w:t>
             </w:r>
           </w:p>
         </w:tc>
@@ -8589,7 +8537,7 @@
           </w:tcPr>
           <w:p>
             <w:r>
-              <w:t>PROPIETARIO</w:t>
+              <w:t>CLIENTE</w:t>
             </w:r>
           </w:p>
         </w:tc>
@@ -8599,7 +8547,7 @@
           </w:tcPr>
           <w:p>
             <w:r>
-              <w:t>nombre_completo</w:t>
+              <w:t>nombre / correo / teléfono</w:t>
             </w:r>
           </w:p>
         </w:tc>
@@ -8619,7 +8567,7 @@
           </w:tcPr>
           <w:p>
             <w:r>
-              <w:t>Sí</w:t>
+              <w:t>No</w:t>
             </w:r>
           </w:p>
         </w:tc>
@@ -8639,7 +8587,7 @@
           </w:tcPr>
           <w:p>
             <w:r>
-              <w:t>Nombre completo del propietario.</w:t>
+              <w:t>Datos visibles del propietario con cuenta móvil; la contraseña se gestiona en Supabase Auth.</w:t>
             </w:r>
           </w:p>
         </w:tc>
@@ -8661,7 +8609,7 @@
           </w:tcPr>
           <w:p>
             <w:r>
-              <w:t>telefono / correo / dirección</w:t>
+              <w:t>nombre_completo / contacto</w:t>
             </w:r>
           </w:p>
         </w:tc>
@@ -8681,7 +8629,7 @@
           </w:tcPr>
           <w:p>
             <w:r>
-              <w:t>No</w:t>
+              <w:t>Sí/No</w:t>
             </w:r>
           </w:p>
         </w:tc>
@@ -8701,7 +8649,7 @@
           </w:tcPr>
           <w:p>
             <w:r>
-              <w:t>Datos de contacto; usar datos ficticios en pruebas y capturas.</w:t>
+              <w:t>Nombre obligatorio y datos de contacto opcionales de la ficha manual.</w:t>
             </w:r>
           </w:p>
         </w:tc>
@@ -8805,7 +8753,7 @@
           </w:tcPr>
           <w:p>
             <w:r>
-              <w:t>Sí</w:t>
+              <w:t>Condicional</w:t>
             </w:r>
           </w:p>
         </w:tc>
@@ -8825,7 +8773,7 @@
           </w:tcPr>
           <w:p>
             <w:r>
-              <w:t>Propietario responsable.</w:t>
+              <w:t>Titular de una ficha manual. Debe estar vacío si cliente_id tiene valor.</w:t>
             </w:r>
           </w:p>
         </w:tc>
@@ -8847,7 +8795,7 @@
           </w:tcPr>
           <w:p>
             <w:r>
-              <w:t>nombre / especie / raza / sexo</w:t>
+              <w:t>cliente_id</w:t>
             </w:r>
           </w:p>
         </w:tc>
@@ -8857,7 +8805,7 @@
           </w:tcPr>
           <w:p>
             <w:r>
-              <w:t>TEXT</w:t>
+              <w:t>UUID</w:t>
             </w:r>
           </w:p>
         </w:tc>
@@ -8867,7 +8815,7 @@
           </w:tcPr>
           <w:p>
             <w:r>
-              <w:t>Sí/No</w:t>
+              <w:t>Condicional</w:t>
             </w:r>
           </w:p>
         </w:tc>
@@ -8877,7 +8825,7 @@
           </w:tcPr>
           <w:p>
             <w:r>
-              <w:t>—</w:t>
+              <w:t>FK CLIENTE.id</w:t>
             </w:r>
           </w:p>
         </w:tc>
@@ -8887,7 +8835,7 @@
           </w:tcPr>
           <w:p>
             <w:r>
-              <w:t>Datos descriptivos del paciente.</w:t>
+              <w:t>Titular de una cuenta móvil. Debe estar vacío si propietario_id tiene valor. La RLS permite al cliente solo lectura de sus mascotas.</w:t>
             </w:r>
           </w:p>
         </w:tc>
@@ -8909,7 +8857,7 @@
           </w:tcPr>
           <w:p>
             <w:r>
-              <w:t>fecha_nacimiento / peso</w:t>
+              <w:t>nombre / especie / raza / sexo / fecha_nacimiento / peso</w:t>
             </w:r>
           </w:p>
         </w:tc>
@@ -8919,7 +8867,7 @@
           </w:tcPr>
           <w:p>
             <w:r>
-              <w:t>DATE / NUMERIC</w:t>
+              <w:t>TEXT / DATE / NUMERIC</w:t>
             </w:r>
           </w:p>
         </w:tc>
@@ -8929,7 +8877,7 @@
           </w:tcPr>
           <w:p>
             <w:r>
-              <w:t>No</w:t>
+              <w:t>Sí/No</w:t>
             </w:r>
           </w:p>
         </w:tc>
@@ -8949,7 +8897,7 @@
           </w:tcPr>
           <w:p>
             <w:r>
-              <w:t>Fecha de nacimiento y peso si fueron registrados.</w:t>
+              <w:t>Nombre obligatorio y datos descriptivos opcionales del paciente. Exactamente uno de cliente_id o propietario_id debe tener valor.</w:t>
             </w:r>
           </w:p>
         </w:tc>
@@ -9570,7 +9518,7 @@
           </w:tcPr>
           <w:p>
             <w:r>
-              <w:t>Invitación de Supabase Auth (flujo de servidor seguro)</w:t>
+              <w:t>/functions/v1/crear-propietario</w:t>
             </w:r>
           </w:p>
         </w:tc>
@@ -9590,7 +9538,7 @@
           </w:tcPr>
           <w:p>
             <w:r>
-              <w:t>Personal autorizado</w:t>
+              <w:t>Administrador</w:t>
             </w:r>
           </w:p>
         </w:tc>
@@ -9600,7 +9548,7 @@
           </w:tcPr>
           <w:p>
             <w:r>
-              <w:t>Correo del propietario; nunca service_role en Flutter</w:t>
+              <w:t>Nombre, correo, contraseña y contacto del propietario</w:t>
             </w:r>
           </w:p>
         </w:tc>
@@ -9610,7 +9558,7 @@
           </w:tcPr>
           <w:p>
             <w:r>
-              <w:t>Identidad creada/invitación enviada</w:t>
+              <w:t>200 + cuenta Auth y fila CLIENTE</w:t>
             </w:r>
           </w:p>
         </w:tc>
@@ -9620,7 +9568,7 @@
           </w:tcPr>
           <w:p>
             <w:r>
-              <w:t>400, 401, 409</w:t>
+              <w:t>400, 401, 403, 409</w:t>
             </w:r>
           </w:p>
         </w:tc>
@@ -9662,7 +9610,7 @@
           </w:tcPr>
           <w:p>
             <w:r>
-              <w:t>Veterinario</w:t>
+              <w:t>Administrador / veterinario</w:t>
             </w:r>
           </w:p>
         </w:tc>
@@ -9672,7 +9620,7 @@
           </w:tcPr>
           <w:p>
             <w:r>
-              <w:t>JSON del propietario e id_usuario</w:t>
+              <w:t>JSON de ficha manual; no crea cuenta Auth</w:t>
             </w:r>
           </w:p>
         </w:tc>
@@ -9682,7 +9630,7 @@
           </w:tcPr>
           <w:p>
             <w:r>
-              <w:t>201 + registro</w:t>
+              <w:t>201 + ficha manual</w:t>
             </w:r>
           </w:p>
         </w:tc>
@@ -9714,7 +9662,7 @@
           </w:tcPr>
           <w:p>
             <w:r>
-              <w:t>/rest/v1/mascotas?select=*&amp;propietario_id=eq.{id}</w:t>
+              <w:t>/rest/v1/mascotas?select=*</w:t>
             </w:r>
           </w:p>
         </w:tc>
@@ -9734,7 +9682,7 @@
           </w:tcPr>
           <w:p>
             <w:r>
-              <w:t>Veterinario / propietario autorizado</w:t>
+              <w:t>Administrador / veterinario / propietario</w:t>
             </w:r>
           </w:p>
         </w:tc>
@@ -9744,7 +9692,7 @@
           </w:tcPr>
           <w:p>
             <w:r>
-              <w:t>Filtro PostgREST</w:t>
+              <w:t>El propietario ve solo filas con cliente_id = auth.uid() por RLS</w:t>
             </w:r>
           </w:p>
         </w:tc>
@@ -9754,7 +9702,7 @@
           </w:tcPr>
           <w:p>
             <w:r>
-              <w:t>200 + filas visibles; RLS puede devolver lista vacía</w:t>
+              <w:t>200 + filas autorizadas</w:t>
             </w:r>
           </w:p>
         </w:tc>
@@ -9764,7 +9712,7 @@
           </w:tcPr>
           <w:p>
             <w:r>
-              <w:t>400, 401</w:t>
+              <w:t>401; RLS puede devolver lista vacía</w:t>
             </w:r>
           </w:p>
         </w:tc>
@@ -9806,7 +9754,7 @@
           </w:tcPr>
           <w:p>
             <w:r>
-              <w:t>Veterinario</w:t>
+              <w:t>Administrador / veterinario</w:t>
             </w:r>
           </w:p>
         </w:tc>
@@ -9816,7 +9764,7 @@
           </w:tcPr>
           <w:p>
             <w:r>
-              <w:t>JSON con propietario_id y datos de mascota</w:t>
+              <w:t>JSON con cliente_id o propietario_id y datos de mascota</w:t>
             </w:r>
           </w:p>
         </w:tc>
@@ -9836,7 +9784,7 @@
           </w:tcPr>
           <w:p>
             <w:r>
-              <w:t>400, 401, 403</w:t>
+              <w:t>400, 401, 403; RLS deniega al propietario</w:t>
             </w:r>
           </w:p>
         </w:tc>
@@ -9878,7 +9826,7 @@
           </w:tcPr>
           <w:p>
             <w:r>
-              <w:t>Veterinario</w:t>
+              <w:t>Administrador / veterinario</w:t>
             </w:r>
           </w:p>
         </w:tc>
@@ -9908,7 +9856,79 @@
           </w:tcPr>
           <w:p>
             <w:r>
-              <w:t>400, 401; RLS puede devolver 200 sin filas visibles</w:t>
+              <w:t>400, 401, 403; RLS deniega al propietario</w:t>
+            </w:r>
+          </w:p>
+        </w:tc>
+      </w:tr>
+      <w:tr>
+        <w:tc>
+          <w:tcPr>
+            <w:tcW w:type="dxa" w:w="979"/>
+          </w:tcPr>
+          <w:p>
+            <w:r>
+              <w:t>DELETE</w:t>
+            </w:r>
+          </w:p>
+        </w:tc>
+        <w:tc>
+          <w:tcPr>
+            <w:tcW w:type="dxa" w:w="4490"/>
+          </w:tcPr>
+          <w:p>
+            <w:r>
+              <w:t>/rest/v1/mascotas?id=eq.{id}</w:t>
+            </w:r>
+          </w:p>
+        </w:tc>
+        <w:tc>
+          <w:tcPr>
+            <w:tcW w:type="dxa" w:w="656"/>
+          </w:tcPr>
+          <w:p>
+            <w:r>
+              <w:t>Sí</w:t>
+            </w:r>
+          </w:p>
+        </w:tc>
+        <w:tc>
+          <w:tcPr>
+            <w:tcW w:type="dxa" w:w="1361"/>
+          </w:tcPr>
+          <w:p>
+            <w:r>
+              <w:t>Administrador / veterinario</w:t>
+            </w:r>
+          </w:p>
+        </w:tc>
+        <w:tc>
+          <w:tcPr>
+            <w:tcW w:type="dxa" w:w="1655"/>
+          </w:tcPr>
+          <w:p>
+            <w:r>
+              <w:t>ID de la mascota</w:t>
+            </w:r>
+          </w:p>
+        </w:tc>
+        <w:tc>
+          <w:tcPr>
+            <w:tcW w:type="dxa" w:w="1455"/>
+          </w:tcPr>
+          <w:p>
+            <w:r>
+              <w:t>204 o representación de la fila eliminada</w:t>
+            </w:r>
+          </w:p>
+        </w:tc>
+        <w:tc>
+          <w:tcPr>
+            <w:tcW w:type="dxa" w:w="912"/>
+          </w:tcPr>
+          <w:p>
+            <w:r>
+              <w:t>401, 403; RLS deniega al propietario</w:t>
             </w:r>
           </w:p>
         </w:tc>
@@ -11073,7 +11093,7 @@
     <w:p>
       <w:pPr/>
       <w:r>
-        <w:t>Antes de entregar se requiere completar la ciudad de EIVET y las mediciones observadas del proceso actual; adjuntar el enlace y captura fechada del tablero; confirmar acceso docente al repositorio; definir la URL pública web; registrar la versión exacta de Flutter usada; y comprobar que las políticas RLS publicadas incluyen el vínculo PROPIETARIO.id_usuario con auth.users. Usar datos ficticios en capturas y pruebas. El plan gratuito de Supabase puede pausar proyectos inactivos; comprobar su disponibilidad antes de la evaluación.</w:t>
+        <w:t>Antes de entregar se requiere completar la ciudad de EIVET y las mediciones observadas del proceso actual; adjuntar el enlace y captura fechada del tablero; confirmar acceso docente al repositorio; definir la URL pública web; registrar la versión exacta de Flutter usada; y comprobar que CLIENTE.id está vinculado a auth.users.id, que cada mascota tiene un solo titular y que RLS reserva su escritura al administrador y veterinario. Usar datos ficticios en capturas y pruebas. El plan gratuito de Supabase puede pausar proyectos inactivos; comprobar su disponibilidad antes de la evaluación.</w:t>
       </w:r>
     </w:p>
     <w:sectPr>

</xml_diff>